<commit_message>
Updating the code rubric.
</commit_message>
<xml_diff>
--- a/docs/CodeEvaluationRubric-DesignGuidelines.docx
+++ b/docs/CodeEvaluationRubric-DesignGuidelines.docx
@@ -3760,12 +3760,15 @@
           <w:numId w:val="9"/>
         </w:numPr>
         <w:ind w:left="720" w:hanging="360"/>
-      </w:pPr>
-      <w:r>
-        <w:rPr>
-          <w:rtl w:val="0"/>
-        </w:rPr>
-        <w:t xml:space="preserve">One-Line Docstrings:</w:t>
+        <w:rPr>
+          <w:u w:val="none"/>
+        </w:rPr>
+      </w:pPr>
+      <w:r>
+        <w:rPr>
+          <w:rtl w:val="0"/>
+        </w:rPr>
+        <w:t xml:space="preserve">Mood and Style:</w:t>
       </w:r>
     </w:p>
     <w:p>
@@ -3780,7 +3783,7 @@
         <w:rPr>
           <w:rtl w:val="0"/>
         </w:rPr>
-        <w:t xml:space="preserve">A one-line docstring must be used when the behavior can be completely described in a single, non-redundant sentence.</w:t>
+        <w:t xml:space="preserve">Module docstrings should be written in the indicative mood, clearly describing what the module provides, defines, or implements. They should explain the module's purpose at a high level and be written in clear, ordinary prose structured into complete sentences and paragraphs.</w:t>
       </w:r>
     </w:p>
     <w:p>
@@ -3795,7 +3798,22 @@
         <w:rPr>
           <w:rtl w:val="0"/>
         </w:rPr>
-        <w:t xml:space="preserve">The summary line should clearly describe the observable behavior of the function.</w:t>
+        <w:t xml:space="preserve">Class docstrings should be written in the indicative mood, typically as a noun phrase or descriptive statement, clearly describing what the class represents or encapsulates. They should focus on the class's role, meaning, and intended use, and be written in clear, ordinary prose.</w:t>
+      </w:r>
+    </w:p>
+    <w:p>
+      <w:pPr>
+        <w:numPr>
+          <w:ilvl w:val="1"/>
+          <w:numId w:val="9"/>
+        </w:numPr>
+        <w:ind w:left="1440" w:hanging="360"/>
+      </w:pPr>
+      <w:r>
+        <w:rPr>
+          <w:rtl w:val="0"/>
+        </w:rPr>
+        <w:t xml:space="preserve">Function docstrings should be written in the imperative mood using clear, ordinary prose and complete sentences.</w:t>
       </w:r>
     </w:p>
     <w:p>
@@ -3810,7 +3828,7 @@
         <w:rPr>
           <w:rtl w:val="0"/>
         </w:rPr>
-        <w:t xml:space="preserve">Parameter Documentation:</w:t>
+        <w:t xml:space="preserve">One-Line Docstrings:</w:t>
       </w:r>
     </w:p>
     <w:p>
@@ -3825,7 +3843,7 @@
         <w:rPr>
           <w:rtl w:val="0"/>
         </w:rPr>
-        <w:t xml:space="preserve">The :param field should only be used when it provides meaningful clarification beyond the parameter name and type.</w:t>
+        <w:t xml:space="preserve">A one-line docstring must be used when the behavior can be completely described in a single, non-redundant sentence.</w:t>
       </w:r>
     </w:p>
     <w:p>
@@ -3840,7 +3858,7 @@
         <w:rPr>
           <w:rtl w:val="0"/>
         </w:rPr>
-        <w:t xml:space="preserve">Avoid documenting parameters when doing so merely repeats information already obvious from the function signature.</w:t>
+        <w:t xml:space="preserve">The summary line should clearly describe the observable behavior of the function.</w:t>
       </w:r>
     </w:p>
     <w:p>
@@ -3855,7 +3873,7 @@
         <w:rPr>
           <w:rtl w:val="0"/>
         </w:rPr>
-        <w:t xml:space="preserve">Behavioral Details and Bullet Lists:</w:t>
+        <w:t xml:space="preserve">Parameter Documentation:</w:t>
       </w:r>
     </w:p>
     <w:p>
@@ -3870,7 +3888,7 @@
         <w:rPr>
           <w:rtl w:val="0"/>
         </w:rPr>
-        <w:t xml:space="preserve">When additional behavioral details are required, prefer documenting them using bullet points within the docstring body rather than introducing :param, :return:, or :raises: fields that merely restate obvious information.</w:t>
+        <w:t xml:space="preserve">The :param field should only be used when it provides meaningful clarification beyond the parameter name and type.</w:t>
       </w:r>
     </w:p>
     <w:p>
@@ -3885,82 +3903,7 @@
         <w:rPr>
           <w:rtl w:val="0"/>
         </w:rPr>
-        <w:t xml:space="preserve">Bullet points should be used to describe behavioral guarantees such as:</w:t>
-      </w:r>
-    </w:p>
-    <w:p>
-      <w:pPr>
-        <w:numPr>
-          <w:ilvl w:val="2"/>
-          <w:numId w:val="9"/>
-        </w:numPr>
-        <w:ind w:left="2160" w:hanging="360"/>
-      </w:pPr>
-      <w:r>
-        <w:rPr>
-          <w:rtl w:val="0"/>
-        </w:rPr>
-        <w:t xml:space="preserve">errors handled or suppressed</w:t>
-      </w:r>
-    </w:p>
-    <w:p>
-      <w:pPr>
-        <w:numPr>
-          <w:ilvl w:val="2"/>
-          <w:numId w:val="9"/>
-        </w:numPr>
-        <w:ind w:left="2160" w:hanging="360"/>
-      </w:pPr>
-      <w:r>
-        <w:rPr>
-          <w:rtl w:val="0"/>
-        </w:rPr>
-        <w:t xml:space="preserve">conditions under which values are returned or skipped</w:t>
-      </w:r>
-    </w:p>
-    <w:p>
-      <w:pPr>
-        <w:numPr>
-          <w:ilvl w:val="2"/>
-          <w:numId w:val="9"/>
-        </w:numPr>
-        <w:ind w:left="2160" w:hanging="360"/>
-      </w:pPr>
-      <w:r>
-        <w:rPr>
-          <w:rtl w:val="0"/>
-        </w:rPr>
-        <w:t xml:space="preserve">iteration or yielding semantics</w:t>
-      </w:r>
-    </w:p>
-    <w:p>
-      <w:pPr>
-        <w:numPr>
-          <w:ilvl w:val="2"/>
-          <w:numId w:val="9"/>
-        </w:numPr>
-        <w:ind w:left="2160" w:hanging="360"/>
-      </w:pPr>
-      <w:r>
-        <w:rPr>
-          <w:rtl w:val="0"/>
-        </w:rPr>
-        <w:t xml:space="preserve">lifetime or validity of returned objects</w:t>
-      </w:r>
-    </w:p>
-    <w:p>
-      <w:pPr>
-        <w:numPr>
-          <w:ilvl w:val="2"/>
-          <w:numId w:val="9"/>
-        </w:numPr>
-        <w:ind w:left="2160" w:hanging="360"/>
-      </w:pPr>
-      <w:r>
-        <w:rPr>
-          <w:rtl w:val="0"/>
-        </w:rPr>
-        <w:t xml:space="preserve">side effects or configuration interactions</w:t>
+        <w:t xml:space="preserve">Avoid documenting parameters when doing so merely repeats information already obvious from the function signature.</w:t>
       </w:r>
     </w:p>
     <w:p>
@@ -3975,7 +3918,7 @@
         <w:rPr>
           <w:rtl w:val="0"/>
         </w:rPr>
-        <w:t xml:space="preserve">Return Value Documentation:</w:t>
+        <w:t xml:space="preserve">Behavioral Details and Bullet Lists:</w:t>
       </w:r>
     </w:p>
     <w:p>
@@ -3990,7 +3933,7 @@
         <w:rPr>
           <w:rtl w:val="0"/>
         </w:rPr>
-        <w:t xml:space="preserve">Return behavior should be documented when it would not be obvious from the function name and signature.</w:t>
+        <w:t xml:space="preserve">When additional behavioral details are required, prefer documenting them using bullet points within the docstring body rather than introducing :param, :return:, or :raises: fields that merely restate obvious information.</w:t>
       </w:r>
     </w:p>
     <w:p>
@@ -4005,7 +3948,7 @@
         <w:rPr>
           <w:rtl w:val="0"/>
         </w:rPr>
-        <w:t xml:space="preserve">This may be done either:</w:t>
+        <w:t xml:space="preserve">Bullet points should be used to describe behavioral guarantees such as:</w:t>
       </w:r>
     </w:p>
     <w:p>
@@ -4020,7 +3963,7 @@
         <w:rPr>
           <w:rtl w:val="0"/>
         </w:rPr>
-        <w:t xml:space="preserve">directly in the summary sentence, or</w:t>
+        <w:t xml:space="preserve">errors handled or suppressed</w:t>
       </w:r>
     </w:p>
     <w:p>
@@ -4035,22 +3978,52 @@
         <w:rPr>
           <w:rtl w:val="0"/>
         </w:rPr>
-        <w:t xml:space="preserve">using bullet points describing the structure and semantics of the returned value.</w:t>
-      </w:r>
-    </w:p>
-    <w:p>
-      <w:pPr>
-        <w:numPr>
-          <w:ilvl w:val="1"/>
+        <w:t xml:space="preserve">conditions under which values are returned or skipped</w:t>
+      </w:r>
+    </w:p>
+    <w:p>
+      <w:pPr>
+        <w:numPr>
+          <w:ilvl w:val="2"/>
           <w:numId w:val="9"/>
         </w:numPr>
-        <w:ind w:left="1440" w:hanging="360"/>
-      </w:pPr>
-      <w:r>
-        <w:rPr>
-          <w:rtl w:val="0"/>
-        </w:rPr>
-        <w:t xml:space="preserve">The :return: field should only be used when it adds meaningful clarity that cannot be expressed naturally in the summary or bullet points.</w:t>
+        <w:ind w:left="2160" w:hanging="360"/>
+      </w:pPr>
+      <w:r>
+        <w:rPr>
+          <w:rtl w:val="0"/>
+        </w:rPr>
+        <w:t xml:space="preserve">iteration or yielding semantics</w:t>
+      </w:r>
+    </w:p>
+    <w:p>
+      <w:pPr>
+        <w:numPr>
+          <w:ilvl w:val="2"/>
+          <w:numId w:val="9"/>
+        </w:numPr>
+        <w:ind w:left="2160" w:hanging="360"/>
+      </w:pPr>
+      <w:r>
+        <w:rPr>
+          <w:rtl w:val="0"/>
+        </w:rPr>
+        <w:t xml:space="preserve">lifetime or validity of returned objects</w:t>
+      </w:r>
+    </w:p>
+    <w:p>
+      <w:pPr>
+        <w:numPr>
+          <w:ilvl w:val="2"/>
+          <w:numId w:val="9"/>
+        </w:numPr>
+        <w:ind w:left="2160" w:hanging="360"/>
+      </w:pPr>
+      <w:r>
+        <w:rPr>
+          <w:rtl w:val="0"/>
+        </w:rPr>
+        <w:t xml:space="preserve">side effects or configuration interactions</w:t>
       </w:r>
     </w:p>
     <w:p>
@@ -4065,7 +4038,7 @@
         <w:rPr>
           <w:rtl w:val="0"/>
         </w:rPr>
-        <w:t xml:space="preserve">Exception Documentation:</w:t>
+        <w:t xml:space="preserve">Return Value Documentation:</w:t>
       </w:r>
     </w:p>
     <w:p>
@@ -4080,7 +4053,7 @@
         <w:rPr>
           <w:rtl w:val="0"/>
         </w:rPr>
-        <w:t xml:space="preserve">Use :raises: only when the exception is not obvious from the implementation or function purpose, or when documenting the exception is necessary to understand correct usage.</w:t>
+        <w:t xml:space="preserve">Return behavior should be documented when it would not be obvious from the function name and signature.</w:t>
       </w:r>
     </w:p>
     <w:p>
@@ -4095,7 +4068,52 @@
         <w:rPr>
           <w:rtl w:val="0"/>
         </w:rPr>
-        <w:t xml:space="preserve">Avoid documenting obvious exceptions raised by underlying library functions unless they are intentionally part of the public contract.</w:t>
+        <w:t xml:space="preserve">This may be done either:</w:t>
+      </w:r>
+    </w:p>
+    <w:p>
+      <w:pPr>
+        <w:numPr>
+          <w:ilvl w:val="2"/>
+          <w:numId w:val="9"/>
+        </w:numPr>
+        <w:ind w:left="2160" w:hanging="360"/>
+      </w:pPr>
+      <w:r>
+        <w:rPr>
+          <w:rtl w:val="0"/>
+        </w:rPr>
+        <w:t xml:space="preserve">directly in the summary sentence, or</w:t>
+      </w:r>
+    </w:p>
+    <w:p>
+      <w:pPr>
+        <w:numPr>
+          <w:ilvl w:val="2"/>
+          <w:numId w:val="9"/>
+        </w:numPr>
+        <w:ind w:left="2160" w:hanging="360"/>
+      </w:pPr>
+      <w:r>
+        <w:rPr>
+          <w:rtl w:val="0"/>
+        </w:rPr>
+        <w:t xml:space="preserve">using bullet points describing the structure and semantics of the returned value.</w:t>
+      </w:r>
+    </w:p>
+    <w:p>
+      <w:pPr>
+        <w:numPr>
+          <w:ilvl w:val="1"/>
+          <w:numId w:val="9"/>
+        </w:numPr>
+        <w:ind w:left="1440" w:hanging="360"/>
+      </w:pPr>
+      <w:r>
+        <w:rPr>
+          <w:rtl w:val="0"/>
+        </w:rPr>
+        <w:t xml:space="preserve">The :return: field should only be used when it adds meaningful clarity that cannot be expressed naturally in the summary or bullet points.</w:t>
       </w:r>
     </w:p>
     <w:p>
@@ -4110,7 +4128,7 @@
         <w:rPr>
           <w:rtl w:val="0"/>
         </w:rPr>
-        <w:t xml:space="preserve">Redundancy Guidelines:</w:t>
+        <w:t xml:space="preserve">Exception Documentation:</w:t>
       </w:r>
     </w:p>
     <w:p>
@@ -4125,82 +4143,22 @@
         <w:rPr>
           <w:rtl w:val="0"/>
         </w:rPr>
-        <w:t xml:space="preserve">Documentation should avoid repeating information that is already clear from:</w:t>
-      </w:r>
-    </w:p>
-    <w:p>
-      <w:pPr>
-        <w:numPr>
-          <w:ilvl w:val="2"/>
+        <w:t xml:space="preserve">Use :raises: only when the exception is not obvious from the implementation or function purpose, or when documenting the exception is necessary to understand correct usage.</w:t>
+      </w:r>
+    </w:p>
+    <w:p>
+      <w:pPr>
+        <w:numPr>
+          <w:ilvl w:val="1"/>
           <w:numId w:val="9"/>
         </w:numPr>
-        <w:ind w:left="2160" w:hanging="360"/>
-      </w:pPr>
-      <w:r>
-        <w:rPr>
-          <w:rtl w:val="0"/>
-        </w:rPr>
-        <w:t xml:space="preserve">function names</w:t>
-      </w:r>
-    </w:p>
-    <w:p>
-      <w:pPr>
-        <w:numPr>
-          <w:ilvl w:val="2"/>
-          <w:numId w:val="9"/>
-        </w:numPr>
-        <w:ind w:left="2160" w:hanging="360"/>
-      </w:pPr>
-      <w:r>
-        <w:rPr>
-          <w:rtl w:val="0"/>
-        </w:rPr>
-        <w:t xml:space="preserve">parameter names</w:t>
-      </w:r>
-    </w:p>
-    <w:p>
-      <w:pPr>
-        <w:numPr>
-          <w:ilvl w:val="2"/>
-          <w:numId w:val="9"/>
-        </w:numPr>
-        <w:ind w:left="2160" w:hanging="360"/>
-      </w:pPr>
-      <w:r>
-        <w:rPr>
-          <w:rtl w:val="0"/>
-        </w:rPr>
-        <w:t xml:space="preserve">type annotations</w:t>
-      </w:r>
-    </w:p>
-    <w:p>
-      <w:pPr>
-        <w:numPr>
-          <w:ilvl w:val="2"/>
-          <w:numId w:val="9"/>
-        </w:numPr>
-        <w:ind w:left="2160" w:hanging="360"/>
-      </w:pPr>
-      <w:r>
-        <w:rPr>
-          <w:rtl w:val="0"/>
-        </w:rPr>
-        <w:t xml:space="preserve">surrounding context</w:t>
-      </w:r>
-    </w:p>
-    <w:p>
-      <w:pPr>
-        <w:numPr>
-          <w:ilvl w:val="1"/>
-          <w:numId w:val="9"/>
-        </w:numPr>
-        <w:ind w:left="1440" w:hanging="360"/>
-      </w:pPr>
-      <w:r>
-        <w:rPr>
-          <w:rtl w:val="0"/>
-        </w:rPr>
-        <w:t xml:space="preserve">When redundancy exists, prefer documenting behavior and guarantees rather than repeating structural details.</w:t>
+        <w:ind w:left="1440" w:hanging="360"/>
+      </w:pPr>
+      <w:r>
+        <w:rPr>
+          <w:rtl w:val="0"/>
+        </w:rPr>
+        <w:t xml:space="preserve">Avoid documenting obvious exceptions raised by underlying library functions unless they are intentionally part of the public contract.</w:t>
       </w:r>
     </w:p>
     <w:p>
@@ -4210,6 +4168,111 @@
           <w:numId w:val="9"/>
         </w:numPr>
         <w:ind w:left="720" w:hanging="360"/>
+      </w:pPr>
+      <w:r>
+        <w:rPr>
+          <w:rtl w:val="0"/>
+        </w:rPr>
+        <w:t xml:space="preserve">Redundancy Guidelines:</w:t>
+      </w:r>
+    </w:p>
+    <w:p>
+      <w:pPr>
+        <w:numPr>
+          <w:ilvl w:val="1"/>
+          <w:numId w:val="9"/>
+        </w:numPr>
+        <w:ind w:left="1440" w:hanging="360"/>
+      </w:pPr>
+      <w:r>
+        <w:rPr>
+          <w:rtl w:val="0"/>
+        </w:rPr>
+        <w:t xml:space="preserve">Documentation should avoid repeating information that is already clear from:</w:t>
+      </w:r>
+    </w:p>
+    <w:p>
+      <w:pPr>
+        <w:numPr>
+          <w:ilvl w:val="2"/>
+          <w:numId w:val="9"/>
+        </w:numPr>
+        <w:ind w:left="2160" w:hanging="360"/>
+      </w:pPr>
+      <w:r>
+        <w:rPr>
+          <w:rtl w:val="0"/>
+        </w:rPr>
+        <w:t xml:space="preserve">function names</w:t>
+      </w:r>
+    </w:p>
+    <w:p>
+      <w:pPr>
+        <w:numPr>
+          <w:ilvl w:val="2"/>
+          <w:numId w:val="9"/>
+        </w:numPr>
+        <w:ind w:left="2160" w:hanging="360"/>
+      </w:pPr>
+      <w:r>
+        <w:rPr>
+          <w:rtl w:val="0"/>
+        </w:rPr>
+        <w:t xml:space="preserve">parameter names</w:t>
+      </w:r>
+    </w:p>
+    <w:p>
+      <w:pPr>
+        <w:numPr>
+          <w:ilvl w:val="2"/>
+          <w:numId w:val="9"/>
+        </w:numPr>
+        <w:ind w:left="2160" w:hanging="360"/>
+      </w:pPr>
+      <w:r>
+        <w:rPr>
+          <w:rtl w:val="0"/>
+        </w:rPr>
+        <w:t xml:space="preserve">type annotations</w:t>
+      </w:r>
+    </w:p>
+    <w:p>
+      <w:pPr>
+        <w:numPr>
+          <w:ilvl w:val="2"/>
+          <w:numId w:val="9"/>
+        </w:numPr>
+        <w:ind w:left="2160" w:hanging="360"/>
+      </w:pPr>
+      <w:r>
+        <w:rPr>
+          <w:rtl w:val="0"/>
+        </w:rPr>
+        <w:t xml:space="preserve">surrounding context</w:t>
+      </w:r>
+    </w:p>
+    <w:p>
+      <w:pPr>
+        <w:numPr>
+          <w:ilvl w:val="1"/>
+          <w:numId w:val="9"/>
+        </w:numPr>
+        <w:ind w:left="1440" w:hanging="360"/>
+      </w:pPr>
+      <w:r>
+        <w:rPr>
+          <w:rtl w:val="0"/>
+        </w:rPr>
+        <w:t xml:space="preserve">When redundancy exists, prefer documenting behavior and guarantees rather than repeating structural details.</w:t>
+      </w:r>
+    </w:p>
+    <w:p>
+      <w:pPr>
+        <w:numPr>
+          <w:ilvl w:val="0"/>
+          <w:numId w:val="9"/>
+        </w:numPr>
+        <w:ind w:left="720" w:hanging="360"/>
         <w:rPr>
           <w:b w:val="1"/>
           <w:bCs w:val="1"/>
@@ -4237,6 +4300,39 @@
           <w:rtl w:val="0"/>
         </w:rPr>
         <w:t xml:space="preserve">Prefer clear function names and signatures so docstrings can remain short.</w:t>
+      </w:r>
+    </w:p>
+    <w:p>
+      <w:pPr>
+        <w:numPr>
+          <w:ilvl w:val="1"/>
+          <w:numId w:val="9"/>
+        </w:numPr>
+        <w:ind w:left="1440" w:hanging="360"/>
+      </w:pPr>
+      <w:r>
+        <w:rPr>
+          <w:rtl w:val="0"/>
+        </w:rPr>
+        <w:t xml:space="preserve">Docstring mood is correct: modules and classes use indicative mood; functions use imperative mood.</w:t>
+      </w:r>
+    </w:p>
+    <w:p>
+      <w:pPr>
+        <w:numPr>
+          <w:ilvl w:val="1"/>
+          <w:numId w:val="9"/>
+        </w:numPr>
+        <w:ind w:left="1440" w:hanging="360"/>
+        <w:rPr>
+          <w:u w:val="none"/>
+        </w:rPr>
+      </w:pPr>
+      <w:r>
+        <w:rPr>
+          <w:rtl w:val="0"/>
+        </w:rPr>
+        <w:t xml:space="preserve">Docstrings describe behavior, not implementation details.</w:t>
       </w:r>
     </w:p>
     <w:p>

</xml_diff>